<commit_message>
Atualização do documento de requisitos
</commit_message>
<xml_diff>
--- a/DOCUMENTO DE ESPECIFICAÇÃO RECUPERADOR DE EXCEL.docx
+++ b/DOCUMENTO DE ESPECIFICAÇÃO RECUPERADOR DE EXCEL.docx
@@ -18,35 +18,18 @@
       </w:r>
     </w:p>
     <w:p>
-      <w:r>
-        <w:rPr>
-          <w:b/>
-          <w:bCs/>
-        </w:rPr>
-        <w:t>Data:</w:t>
-      </w:r>
-      <w:r>
-        <w:t xml:space="preserve"> 18 de </w:t>
-      </w:r>
-      <w:proofErr w:type="gramStart"/>
-      <w:r>
-        <w:t>Março</w:t>
-      </w:r>
-      <w:proofErr w:type="gramEnd"/>
-      <w:r>
-        <w:t xml:space="preserve"> de 2026</w:t>
-      </w:r>
-    </w:p>
-    <w:p>
-      <w:r>
-        <w:rPr>
-          <w:b/>
-          <w:bCs/>
-        </w:rPr>
-        <w:t>Responsável:</w:t>
-      </w:r>
-      <w:r>
-        <w:t xml:space="preserve"> Lucas Silva</w:t>
+      <w:pPr>
+        <w:rPr>
+          <w:b/>
+          <w:bCs/>
+        </w:rPr>
+      </w:pPr>
+      <w:r>
+        <w:rPr>
+          <w:b/>
+          <w:bCs/>
+        </w:rPr>
+        <w:t>Data: 14 de Abril de 2026 Responsável: Lucas Silva</w:t>
       </w:r>
     </w:p>
     <w:p>
@@ -80,16 +63,18 @@
       </w:r>
     </w:p>
     <w:p>
-      <w:r>
-        <w:t>Arquivos de planilha eletrônica (.</w:t>
-      </w:r>
-      <w:proofErr w:type="spellStart"/>
-      <w:r>
-        <w:t>xlsx</w:t>
-      </w:r>
-      <w:proofErr w:type="spellEnd"/>
-      <w:r>
-        <w:t>) são suscetíveis a corrupção de metadados XML, bloqueios por senhas esquecidas ou lentidão extrema devido ao excesso de estilos e formatação. Recuperar os dados brutos manualmente desses arquivos é um processo moroso e tecnicamente complexo para o usuário comum.</w:t>
+      <w:pPr>
+        <w:rPr>
+          <w:b/>
+          <w:bCs/>
+        </w:rPr>
+      </w:pPr>
+      <w:r>
+        <w:rPr>
+          <w:b/>
+          <w:bCs/>
+        </w:rPr>
+        <w:t>Arquivos de planilha eletrônica (.xlsx) são suscetíveis a corrupção de metadados XML, bloqueios por senhas esquecidas, lentidão extrema devido ao excesso de estilos e formatação, além de frequentemente acumularem dados duplicados que prejudicam a análise. Recuperar os dados brutos manualmente e higienizar essas planilhas é um processo moroso e tecnicamente complexo para o usuário comum.</w:t>
       </w:r>
     </w:p>
     <w:p>
@@ -108,81 +93,89 @@
       </w:r>
     </w:p>
     <w:p>
-      <w:r>
-        <w:t xml:space="preserve">O </w:t>
-      </w:r>
-      <w:r>
-        <w:rPr>
-          <w:b/>
-          <w:bCs/>
-        </w:rPr>
-        <w:t>Recuperador de Excel</w:t>
-      </w:r>
-      <w:r>
-        <w:t xml:space="preserve"> é uma ferramenta Web focada em "Data Rescue" (Resgate de Dados). A aplicação realiza a extração seletiva de conteúdo, higienização de caracteres e reconstrução da estrutura do arquivo, entregando uma versão funcional e "limpa" ao usuário em segundos.</w:t>
-      </w:r>
-    </w:p>
-    <w:p/>
-    <w:p>
-      <w:pPr>
-        <w:rPr>
-          <w:b/>
-          <w:bCs/>
-        </w:rPr>
-      </w:pPr>
-      <w:r>
-        <w:rPr>
-          <w:b/>
-          <w:bCs/>
+      <w:pPr>
+        <w:rPr>
+          <w:b/>
+          <w:bCs/>
+        </w:rPr>
+      </w:pPr>
+      <w:r>
+        <w:rPr>
+          <w:b/>
+          <w:bCs/>
+        </w:rPr>
+        <w:t>O Recuperador de Excel é uma ferramenta Web focada em "Data Rescue" (Resgate de Dados) e higienização. A aplicação realiza a extração seletiva de conteúdo, detecção inteligente de dados duplicados, higienização de caracteres e reconstrução da estrutura do arquivo, entregando uma versão funcional, leve e "limpa" ao usuário em segundos.</w:t>
+      </w:r>
+    </w:p>
+    <w:p>
+      <w:pPr>
+        <w:rPr>
+          <w:b/>
+          <w:bCs/>
+        </w:rPr>
+      </w:pPr>
+    </w:p>
+    <w:p>
+      <w:pPr>
+        <w:rPr>
+          <w:b/>
+          <w:bCs/>
+          <w:u w:val="single"/>
+        </w:rPr>
+      </w:pPr>
+      <w:r>
+        <w:rPr>
+          <w:b/>
+          <w:bCs/>
+          <w:u w:val="single"/>
         </w:rPr>
         <w:t>2. REGRAS DE NEGÓCIO (RN)</w:t>
       </w:r>
     </w:p>
     <w:p>
-      <w:r>
+      <w:pPr>
+        <w:rPr>
+          <w:b/>
+          <w:bCs/>
+          <w:u w:val="single"/>
+        </w:rPr>
+      </w:pPr>
+      <w:r>
+        <w:rPr>
+          <w:b/>
+          <w:bCs/>
+          <w:u w:val="single"/>
+        </w:rPr>
         <w:t>As regras abaixo regem o comportamento e as limitações do serviço.</w:t>
       </w:r>
     </w:p>
-    <w:p/>
     <w:tbl>
       <w:tblPr>
-        <w:tblW w:w="0" w:type="auto"/>
-        <w:tblCellSpacing w:w="15" w:type="dxa"/>
-        <w:tblCellMar>
-          <w:left w:w="0" w:type="dxa"/>
-          <w:right w:w="0" w:type="dxa"/>
-        </w:tblCellMar>
+        <w:tblStyle w:val="Tabelacomgrade"/>
+        <w:tblW w:w="8668" w:type="dxa"/>
         <w:tblLook w:val="04A0" w:firstRow="1" w:lastRow="0" w:firstColumn="1" w:lastColumn="0" w:noHBand="0" w:noVBand="1"/>
       </w:tblPr>
       <w:tblGrid>
-        <w:gridCol w:w="792"/>
-        <w:gridCol w:w="1857"/>
-        <w:gridCol w:w="5839"/>
+        <w:gridCol w:w="2889"/>
+        <w:gridCol w:w="2889"/>
+        <w:gridCol w:w="2890"/>
       </w:tblGrid>
       <w:tr>
         <w:trPr>
-          <w:tblHeader/>
-          <w:tblCellSpacing w:w="15" w:type="dxa"/>
+          <w:trHeight w:val="491"/>
         </w:trPr>
         <w:tc>
           <w:tcPr>
-            <w:tcW w:w="0" w:type="auto"/>
-            <w:tcBorders>
-              <w:top w:val="single" w:sz="6" w:space="0" w:color="auto"/>
-              <w:left w:val="single" w:sz="6" w:space="0" w:color="auto"/>
-              <w:bottom w:val="single" w:sz="6" w:space="0" w:color="auto"/>
-              <w:right w:val="single" w:sz="6" w:space="0" w:color="auto"/>
-            </w:tcBorders>
-            <w:tcMar>
-              <w:top w:w="240" w:type="dxa"/>
-              <w:left w:w="0" w:type="dxa"/>
-              <w:bottom w:w="240" w:type="dxa"/>
-              <w:right w:w="180" w:type="dxa"/>
-            </w:tcMar>
-            <w:vAlign w:val="center"/>
-            <w:hideMark/>
+            <w:tcW w:w="2889" w:type="dxa"/>
           </w:tcPr>
           <w:p>
+            <w:pPr>
+              <w:jc w:val="center"/>
+              <w:rPr>
+                <w:b/>
+                <w:bCs/>
+              </w:rPr>
+            </w:pPr>
             <w:r>
               <w:rPr>
                 <w:b/>
@@ -194,23 +187,16 @@
         </w:tc>
         <w:tc>
           <w:tcPr>
-            <w:tcW w:w="0" w:type="auto"/>
-            <w:tcBorders>
-              <w:top w:val="single" w:sz="6" w:space="0" w:color="auto"/>
-              <w:left w:val="single" w:sz="6" w:space="0" w:color="auto"/>
-              <w:bottom w:val="single" w:sz="6" w:space="0" w:color="auto"/>
-              <w:right w:val="single" w:sz="6" w:space="0" w:color="auto"/>
-            </w:tcBorders>
-            <w:tcMar>
-              <w:top w:w="240" w:type="dxa"/>
-              <w:left w:w="0" w:type="dxa"/>
-              <w:bottom w:w="240" w:type="dxa"/>
-              <w:right w:w="180" w:type="dxa"/>
-            </w:tcMar>
-            <w:vAlign w:val="center"/>
-            <w:hideMark/>
+            <w:tcW w:w="2889" w:type="dxa"/>
           </w:tcPr>
           <w:p>
+            <w:pPr>
+              <w:jc w:val="center"/>
+              <w:rPr>
+                <w:b/>
+                <w:bCs/>
+              </w:rPr>
+            </w:pPr>
             <w:r>
               <w:rPr>
                 <w:b/>
@@ -222,23 +208,16 @@
         </w:tc>
         <w:tc>
           <w:tcPr>
-            <w:tcW w:w="0" w:type="auto"/>
-            <w:tcBorders>
-              <w:top w:val="single" w:sz="6" w:space="0" w:color="auto"/>
-              <w:left w:val="single" w:sz="6" w:space="0" w:color="auto"/>
-              <w:bottom w:val="single" w:sz="6" w:space="0" w:color="auto"/>
-              <w:right w:val="single" w:sz="6" w:space="0" w:color="auto"/>
-            </w:tcBorders>
-            <w:tcMar>
-              <w:top w:w="240" w:type="dxa"/>
-              <w:left w:w="0" w:type="dxa"/>
-              <w:bottom w:w="240" w:type="dxa"/>
-              <w:right w:w="0" w:type="dxa"/>
-            </w:tcMar>
-            <w:vAlign w:val="center"/>
-            <w:hideMark/>
+            <w:tcW w:w="2890" w:type="dxa"/>
           </w:tcPr>
           <w:p>
+            <w:pPr>
+              <w:jc w:val="center"/>
+              <w:rPr>
+                <w:b/>
+                <w:bCs/>
+              </w:rPr>
+            </w:pPr>
             <w:r>
               <w:rPr>
                 <w:b/>
@@ -251,27 +230,20 @@
       </w:tr>
       <w:tr>
         <w:trPr>
-          <w:tblCellSpacing w:w="15" w:type="dxa"/>
+          <w:trHeight w:val="491"/>
         </w:trPr>
         <w:tc>
           <w:tcPr>
-            <w:tcW w:w="0" w:type="auto"/>
-            <w:tcBorders>
-              <w:top w:val="single" w:sz="6" w:space="0" w:color="auto"/>
-              <w:left w:val="single" w:sz="6" w:space="0" w:color="auto"/>
-              <w:bottom w:val="single" w:sz="6" w:space="0" w:color="auto"/>
-              <w:right w:val="single" w:sz="6" w:space="0" w:color="auto"/>
-            </w:tcBorders>
-            <w:tcMar>
-              <w:top w:w="240" w:type="dxa"/>
-              <w:left w:w="0" w:type="dxa"/>
-              <w:bottom w:w="240" w:type="dxa"/>
-              <w:right w:w="180" w:type="dxa"/>
-            </w:tcMar>
-            <w:vAlign w:val="center"/>
-            <w:hideMark/>
+            <w:tcW w:w="2889" w:type="dxa"/>
           </w:tcPr>
           <w:p>
+            <w:pPr>
+              <w:jc w:val="center"/>
+              <w:rPr>
+                <w:b/>
+                <w:bCs/>
+              </w:rPr>
+            </w:pPr>
             <w:r>
               <w:rPr>
                 <w:b/>
@@ -283,23 +255,16 @@
         </w:tc>
         <w:tc>
           <w:tcPr>
-            <w:tcW w:w="0" w:type="auto"/>
-            <w:tcBorders>
-              <w:top w:val="single" w:sz="6" w:space="0" w:color="auto"/>
-              <w:left w:val="single" w:sz="6" w:space="0" w:color="auto"/>
-              <w:bottom w:val="single" w:sz="6" w:space="0" w:color="auto"/>
-              <w:right w:val="single" w:sz="6" w:space="0" w:color="auto"/>
-            </w:tcBorders>
-            <w:tcMar>
-              <w:top w:w="240" w:type="dxa"/>
-              <w:left w:w="0" w:type="dxa"/>
-              <w:bottom w:w="240" w:type="dxa"/>
-              <w:right w:w="180" w:type="dxa"/>
-            </w:tcMar>
-            <w:vAlign w:val="center"/>
-            <w:hideMark/>
+            <w:tcW w:w="2889" w:type="dxa"/>
           </w:tcPr>
           <w:p>
+            <w:pPr>
+              <w:jc w:val="center"/>
+              <w:rPr>
+                <w:b/>
+                <w:bCs/>
+              </w:rPr>
+            </w:pPr>
             <w:r>
               <w:rPr>
                 <w:b/>
@@ -311,52 +276,41 @@
         </w:tc>
         <w:tc>
           <w:tcPr>
-            <w:tcW w:w="0" w:type="auto"/>
-            <w:tcBorders>
-              <w:top w:val="single" w:sz="6" w:space="0" w:color="auto"/>
-              <w:left w:val="single" w:sz="6" w:space="0" w:color="auto"/>
-              <w:bottom w:val="single" w:sz="6" w:space="0" w:color="auto"/>
-              <w:right w:val="single" w:sz="6" w:space="0" w:color="auto"/>
-            </w:tcBorders>
-            <w:tcMar>
-              <w:top w:w="240" w:type="dxa"/>
-              <w:left w:w="0" w:type="dxa"/>
-              <w:bottom w:w="240" w:type="dxa"/>
-              <w:right w:w="0" w:type="dxa"/>
-            </w:tcMar>
-            <w:vAlign w:val="center"/>
-            <w:hideMark/>
+            <w:tcW w:w="2890" w:type="dxa"/>
           </w:tcPr>
           <w:p>
+            <w:pPr>
+              <w:rPr>
+                <w:b/>
+                <w:bCs/>
+              </w:rPr>
+            </w:pPr>
             <w:r>
-              <w:t>O sistema deve priorizar o conteúdo textual e numérico das células, descartando formatações (estilos, fontes, cores) que possam carregar o erro de corrupção.</w:t>
+              <w:rPr>
+                <w:b/>
+                <w:bCs/>
+              </w:rPr>
+              <w:t>O sistema deve priorizar o conteúdo textual e numérico das células, descartando formatações problemáticas que possam carregar o erro de corrupção.</w:t>
             </w:r>
           </w:p>
         </w:tc>
       </w:tr>
       <w:tr>
         <w:trPr>
-          <w:tblCellSpacing w:w="15" w:type="dxa"/>
+          <w:trHeight w:val="511"/>
         </w:trPr>
         <w:tc>
           <w:tcPr>
-            <w:tcW w:w="0" w:type="auto"/>
-            <w:tcBorders>
-              <w:top w:val="single" w:sz="6" w:space="0" w:color="auto"/>
-              <w:left w:val="single" w:sz="6" w:space="0" w:color="auto"/>
-              <w:bottom w:val="single" w:sz="6" w:space="0" w:color="auto"/>
-              <w:right w:val="single" w:sz="6" w:space="0" w:color="auto"/>
-            </w:tcBorders>
-            <w:tcMar>
-              <w:top w:w="240" w:type="dxa"/>
-              <w:left w:w="0" w:type="dxa"/>
-              <w:bottom w:w="240" w:type="dxa"/>
-              <w:right w:w="180" w:type="dxa"/>
-            </w:tcMar>
-            <w:vAlign w:val="center"/>
-            <w:hideMark/>
+            <w:tcW w:w="2889" w:type="dxa"/>
           </w:tcPr>
           <w:p>
+            <w:pPr>
+              <w:jc w:val="center"/>
+              <w:rPr>
+                <w:b/>
+                <w:bCs/>
+              </w:rPr>
+            </w:pPr>
             <w:r>
               <w:rPr>
                 <w:b/>
@@ -368,61 +322,41 @@
         </w:tc>
         <w:tc>
           <w:tcPr>
-            <w:tcW w:w="0" w:type="auto"/>
-            <w:tcBorders>
-              <w:top w:val="single" w:sz="6" w:space="0" w:color="auto"/>
-              <w:left w:val="single" w:sz="6" w:space="0" w:color="auto"/>
-              <w:bottom w:val="single" w:sz="6" w:space="0" w:color="auto"/>
-              <w:right w:val="single" w:sz="6" w:space="0" w:color="auto"/>
-            </w:tcBorders>
-            <w:tcMar>
-              <w:top w:w="240" w:type="dxa"/>
-              <w:left w:w="0" w:type="dxa"/>
-              <w:bottom w:w="240" w:type="dxa"/>
-              <w:right w:w="180" w:type="dxa"/>
-            </w:tcMar>
-            <w:vAlign w:val="center"/>
-            <w:hideMark/>
+            <w:tcW w:w="2889" w:type="dxa"/>
           </w:tcPr>
           <w:p>
-            <w:proofErr w:type="spellStart"/>
+            <w:pPr>
+              <w:jc w:val="center"/>
+              <w:rPr>
+                <w:b/>
+                <w:bCs/>
+              </w:rPr>
+            </w:pPr>
             <w:r>
               <w:rPr>
                 <w:b/>
                 <w:bCs/>
               </w:rPr>
-              <w:t>Bypass</w:t>
-            </w:r>
-            <w:proofErr w:type="spellEnd"/>
-            <w:r>
-              <w:rPr>
-                <w:b/>
-                <w:bCs/>
-              </w:rPr>
-              <w:t xml:space="preserve"> de Proteção</w:t>
+              <w:t>Bypass de Proteção</w:t>
             </w:r>
           </w:p>
         </w:tc>
         <w:tc>
           <w:tcPr>
-            <w:tcW w:w="0" w:type="auto"/>
-            <w:tcBorders>
-              <w:top w:val="single" w:sz="6" w:space="0" w:color="auto"/>
-              <w:left w:val="single" w:sz="6" w:space="0" w:color="auto"/>
-              <w:bottom w:val="single" w:sz="6" w:space="0" w:color="auto"/>
-              <w:right w:val="single" w:sz="6" w:space="0" w:color="auto"/>
-            </w:tcBorders>
-            <w:tcMar>
-              <w:top w:w="240" w:type="dxa"/>
-              <w:left w:w="0" w:type="dxa"/>
-              <w:bottom w:w="240" w:type="dxa"/>
-              <w:right w:w="0" w:type="dxa"/>
-            </w:tcMar>
-            <w:vAlign w:val="center"/>
-            <w:hideMark/>
+            <w:tcW w:w="2890" w:type="dxa"/>
           </w:tcPr>
           <w:p>
+            <w:pPr>
+              <w:rPr>
+                <w:b/>
+                <w:bCs/>
+              </w:rPr>
+            </w:pPr>
             <w:r>
+              <w:rPr>
+                <w:b/>
+                <w:bCs/>
+              </w:rPr>
               <w:t>O processamento deve gerar um novo arquivo sem travas de edição, independentemente de haver proteção por senha no arquivo de origem.</w:t>
             </w:r>
           </w:p>
@@ -430,160 +364,119 @@
       </w:tr>
       <w:tr>
         <w:trPr>
-          <w:tblCellSpacing w:w="15" w:type="dxa"/>
+          <w:trHeight w:val="491"/>
         </w:trPr>
         <w:tc>
           <w:tcPr>
-            <w:tcW w:w="0" w:type="auto"/>
-            <w:tcBorders>
-              <w:top w:val="single" w:sz="6" w:space="0" w:color="auto"/>
-              <w:left w:val="single" w:sz="6" w:space="0" w:color="auto"/>
-              <w:bottom w:val="single" w:sz="6" w:space="0" w:color="auto"/>
-              <w:right w:val="single" w:sz="6" w:space="0" w:color="auto"/>
-            </w:tcBorders>
-            <w:tcMar>
-              <w:top w:w="240" w:type="dxa"/>
-              <w:left w:w="0" w:type="dxa"/>
-              <w:bottom w:w="240" w:type="dxa"/>
-              <w:right w:w="180" w:type="dxa"/>
-            </w:tcMar>
-            <w:vAlign w:val="center"/>
-            <w:hideMark/>
+            <w:tcW w:w="2889" w:type="dxa"/>
           </w:tcPr>
           <w:p>
+            <w:pPr>
+              <w:jc w:val="center"/>
+              <w:rPr>
+                <w:b/>
+                <w:bCs/>
+              </w:rPr>
+            </w:pPr>
             <w:r>
               <w:rPr>
                 <w:b/>
                 <w:bCs/>
               </w:rPr>
-              <w:lastRenderedPageBreak/>
               <w:t>RN03</w:t>
             </w:r>
           </w:p>
         </w:tc>
         <w:tc>
           <w:tcPr>
-            <w:tcW w:w="0" w:type="auto"/>
-            <w:tcBorders>
-              <w:top w:val="single" w:sz="6" w:space="0" w:color="auto"/>
-              <w:left w:val="single" w:sz="6" w:space="0" w:color="auto"/>
-              <w:bottom w:val="single" w:sz="6" w:space="0" w:color="auto"/>
-              <w:right w:val="single" w:sz="6" w:space="0" w:color="auto"/>
-            </w:tcBorders>
-            <w:tcMar>
-              <w:top w:w="240" w:type="dxa"/>
-              <w:left w:w="0" w:type="dxa"/>
-              <w:bottom w:w="240" w:type="dxa"/>
-              <w:right w:w="180" w:type="dxa"/>
-            </w:tcMar>
-            <w:vAlign w:val="center"/>
-            <w:hideMark/>
+            <w:tcW w:w="2889" w:type="dxa"/>
           </w:tcPr>
           <w:p>
+            <w:pPr>
+              <w:jc w:val="center"/>
+              <w:rPr>
+                <w:b/>
+                <w:bCs/>
+              </w:rPr>
+            </w:pPr>
             <w:r>
               <w:rPr>
                 <w:b/>
                 <w:bCs/>
               </w:rPr>
-              <w:t xml:space="preserve">Limitação de </w:t>
+              <w:t>Limitação de Payload</w:t>
             </w:r>
-            <w:proofErr w:type="spellStart"/>
-            <w:r>
-              <w:rPr>
-                <w:b/>
-                <w:bCs/>
-              </w:rPr>
-              <w:t>Payload</w:t>
-            </w:r>
-            <w:proofErr w:type="spellEnd"/>
           </w:p>
         </w:tc>
         <w:tc>
           <w:tcPr>
-            <w:tcW w:w="0" w:type="auto"/>
-            <w:tcBorders>
-              <w:top w:val="single" w:sz="6" w:space="0" w:color="auto"/>
-              <w:left w:val="single" w:sz="6" w:space="0" w:color="auto"/>
-              <w:bottom w:val="single" w:sz="6" w:space="0" w:color="auto"/>
-              <w:right w:val="single" w:sz="6" w:space="0" w:color="auto"/>
-            </w:tcBorders>
-            <w:tcMar>
-              <w:top w:w="240" w:type="dxa"/>
-              <w:left w:w="0" w:type="dxa"/>
-              <w:bottom w:w="240" w:type="dxa"/>
-              <w:right w:w="0" w:type="dxa"/>
-            </w:tcMar>
-            <w:vAlign w:val="center"/>
-            <w:hideMark/>
+            <w:tcW w:w="2890" w:type="dxa"/>
           </w:tcPr>
           <w:p>
+            <w:pPr>
+              <w:rPr>
+                <w:b/>
+                <w:bCs/>
+              </w:rPr>
+            </w:pPr>
             <w:r>
-              <w:t xml:space="preserve">O sistema limita o processamento a arquivos de até </w:t>
-            </w:r>
-            <w:r>
-              <w:rPr>
-                <w:b/>
-                <w:bCs/>
-              </w:rPr>
-              <w:t>25MB</w:t>
-            </w:r>
-            <w:r>
-              <w:t xml:space="preserve"> para preservar a saúde do servidor em ambiente de nuvem compartilhada.</w:t>
+              <w:rPr>
+                <w:b/>
+                <w:bCs/>
+              </w:rPr>
+              <w:t>O sistema limita o processamento a arquivos de até 25MB para preservar a saúde do servidor em ambiente de nuvem compartilhada.</w:t>
             </w:r>
           </w:p>
         </w:tc>
       </w:tr>
       <w:tr>
         <w:trPr>
-          <w:tblCellSpacing w:w="15" w:type="dxa"/>
+          <w:trHeight w:val="491"/>
         </w:trPr>
         <w:tc>
           <w:tcPr>
-            <w:tcW w:w="0" w:type="auto"/>
+            <w:tcW w:w="2889" w:type="dxa"/>
             <w:tcBorders>
-              <w:top w:val="single" w:sz="6" w:space="0" w:color="auto"/>
-              <w:left w:val="single" w:sz="6" w:space="0" w:color="auto"/>
-              <w:bottom w:val="single" w:sz="6" w:space="0" w:color="auto"/>
-              <w:right w:val="single" w:sz="6" w:space="0" w:color="auto"/>
+              <w:bottom w:val="single" w:sz="4" w:space="0" w:color="auto"/>
             </w:tcBorders>
-            <w:tcMar>
-              <w:top w:w="240" w:type="dxa"/>
-              <w:left w:w="0" w:type="dxa"/>
-              <w:bottom w:w="240" w:type="dxa"/>
-              <w:right w:w="180" w:type="dxa"/>
-            </w:tcMar>
-            <w:vAlign w:val="center"/>
-            <w:hideMark/>
           </w:tcPr>
           <w:p>
+            <w:pPr>
+              <w:jc w:val="center"/>
+              <w:rPr>
+                <w:b/>
+                <w:bCs/>
+              </w:rPr>
+            </w:pPr>
             <w:r>
               <w:rPr>
                 <w:b/>
                 <w:bCs/>
               </w:rPr>
-              <w:t>RN04</w:t>
+              <w:lastRenderedPageBreak/>
+              <w:t>RN0</w:t>
+            </w:r>
+            <w:r>
+              <w:rPr>
+                <w:b/>
+                <w:bCs/>
+              </w:rPr>
+              <w:t>4</w:t>
             </w:r>
           </w:p>
         </w:tc>
         <w:tc>
           <w:tcPr>
-            <w:tcW w:w="0" w:type="auto"/>
-            <w:tcBorders>
-              <w:top w:val="single" w:sz="6" w:space="0" w:color="auto"/>
-              <w:left w:val="single" w:sz="6" w:space="0" w:color="auto"/>
-              <w:bottom w:val="single" w:sz="6" w:space="0" w:color="auto"/>
-              <w:right w:val="single" w:sz="6" w:space="0" w:color="auto"/>
-            </w:tcBorders>
-            <w:tcMar>
-              <w:top w:w="240" w:type="dxa"/>
-              <w:left w:w="0" w:type="dxa"/>
-              <w:bottom w:w="240" w:type="dxa"/>
-              <w:right w:w="180" w:type="dxa"/>
-            </w:tcMar>
-            <w:vAlign w:val="center"/>
-            <w:hideMark/>
+            <w:tcW w:w="2889" w:type="dxa"/>
           </w:tcPr>
           <w:p>
+            <w:pPr>
+              <w:jc w:val="center"/>
+              <w:rPr>
+                <w:b/>
+                <w:bCs/>
+              </w:rPr>
+            </w:pPr>
             <w:r>
               <w:rPr>
                 <w:b/>
@@ -595,59 +488,41 @@
         </w:tc>
         <w:tc>
           <w:tcPr>
-            <w:tcW w:w="0" w:type="auto"/>
-            <w:tcBorders>
-              <w:top w:val="single" w:sz="6" w:space="0" w:color="auto"/>
-              <w:left w:val="single" w:sz="6" w:space="0" w:color="auto"/>
-              <w:bottom w:val="single" w:sz="6" w:space="0" w:color="auto"/>
-              <w:right w:val="single" w:sz="6" w:space="0" w:color="auto"/>
-            </w:tcBorders>
-            <w:tcMar>
-              <w:top w:w="240" w:type="dxa"/>
-              <w:left w:w="0" w:type="dxa"/>
-              <w:bottom w:w="240" w:type="dxa"/>
-              <w:right w:w="0" w:type="dxa"/>
-            </w:tcMar>
-            <w:vAlign w:val="center"/>
-            <w:hideMark/>
+            <w:tcW w:w="2890" w:type="dxa"/>
           </w:tcPr>
           <w:p>
+            <w:pPr>
+              <w:rPr>
+                <w:b/>
+                <w:bCs/>
+              </w:rPr>
+            </w:pPr>
             <w:r>
               <w:rPr>
                 <w:b/>
                 <w:bCs/>
               </w:rPr>
-              <w:t>Segurança:</w:t>
-            </w:r>
-            <w:r>
-              <w:t xml:space="preserve"> O arquivo original deve ser excluído imediatamente após o processamento. O arquivo recuperado deve ser excluído após o download bem-sucedido.</w:t>
+              <w:t>Segurança: O arquivo original deve ser excluído imediatamente após o processamento. O arquivo recuperado deve ser excluído logo após o download bem-sucedido ou via rotina de limpeza (Auto-Cleanup) em 5 minutos.</w:t>
             </w:r>
           </w:p>
         </w:tc>
       </w:tr>
       <w:tr>
         <w:trPr>
-          <w:tblCellSpacing w:w="15" w:type="dxa"/>
+          <w:trHeight w:val="491"/>
         </w:trPr>
         <w:tc>
           <w:tcPr>
-            <w:tcW w:w="0" w:type="auto"/>
-            <w:tcBorders>
-              <w:top w:val="single" w:sz="6" w:space="0" w:color="auto"/>
-              <w:left w:val="single" w:sz="6" w:space="0" w:color="auto"/>
-              <w:bottom w:val="single" w:sz="6" w:space="0" w:color="auto"/>
-              <w:right w:val="single" w:sz="6" w:space="0" w:color="auto"/>
-            </w:tcBorders>
-            <w:tcMar>
-              <w:top w:w="240" w:type="dxa"/>
-              <w:left w:w="0" w:type="dxa"/>
-              <w:bottom w:w="240" w:type="dxa"/>
-              <w:right w:w="180" w:type="dxa"/>
-            </w:tcMar>
-            <w:vAlign w:val="center"/>
-            <w:hideMark/>
+            <w:tcW w:w="2889" w:type="dxa"/>
           </w:tcPr>
           <w:p>
+            <w:pPr>
+              <w:jc w:val="center"/>
+              <w:rPr>
+                <w:b/>
+                <w:bCs/>
+              </w:rPr>
+            </w:pPr>
             <w:r>
               <w:rPr>
                 <w:b/>
@@ -659,23 +534,16 @@
         </w:tc>
         <w:tc>
           <w:tcPr>
-            <w:tcW w:w="0" w:type="auto"/>
-            <w:tcBorders>
-              <w:top w:val="single" w:sz="6" w:space="0" w:color="auto"/>
-              <w:left w:val="single" w:sz="6" w:space="0" w:color="auto"/>
-              <w:bottom w:val="single" w:sz="6" w:space="0" w:color="auto"/>
-              <w:right w:val="single" w:sz="6" w:space="0" w:color="auto"/>
-            </w:tcBorders>
-            <w:tcMar>
-              <w:top w:w="240" w:type="dxa"/>
-              <w:left w:w="0" w:type="dxa"/>
-              <w:bottom w:w="240" w:type="dxa"/>
-              <w:right w:w="180" w:type="dxa"/>
-            </w:tcMar>
-            <w:vAlign w:val="center"/>
-            <w:hideMark/>
+            <w:tcW w:w="2889" w:type="dxa"/>
           </w:tcPr>
           <w:p>
+            <w:pPr>
+              <w:ind w:firstLine="708"/>
+              <w:rPr>
+                <w:b/>
+                <w:bCs/>
+              </w:rPr>
+            </w:pPr>
             <w:r>
               <w:rPr>
                 <w:b/>
@@ -687,39 +555,189 @@
         </w:tc>
         <w:tc>
           <w:tcPr>
-            <w:tcW w:w="0" w:type="auto"/>
-            <w:tcBorders>
-              <w:top w:val="single" w:sz="6" w:space="0" w:color="auto"/>
-              <w:left w:val="single" w:sz="6" w:space="0" w:color="auto"/>
-              <w:bottom w:val="single" w:sz="6" w:space="0" w:color="auto"/>
-              <w:right w:val="single" w:sz="6" w:space="0" w:color="auto"/>
-            </w:tcBorders>
-            <w:tcMar>
-              <w:top w:w="240" w:type="dxa"/>
-              <w:left w:w="0" w:type="dxa"/>
-              <w:bottom w:w="240" w:type="dxa"/>
-              <w:right w:w="0" w:type="dxa"/>
-            </w:tcMar>
-            <w:vAlign w:val="center"/>
-            <w:hideMark/>
+            <w:tcW w:w="2890" w:type="dxa"/>
           </w:tcPr>
           <w:p>
+            <w:pPr>
+              <w:rPr>
+                <w:b/>
+                <w:bCs/>
+              </w:rPr>
+            </w:pPr>
             <w:r>
-              <w:t>Caracteres não imprimíveis (</w:t>
+              <w:rPr>
+                <w:b/>
+                <w:bCs/>
+              </w:rPr>
+              <w:t>Caracteres não imprimíveis (ex: \x00 a \x1F) devem ser removidos para evitar que o novo arquivo gerado seja rejeitado pelo motor do Microsoft Excel.</w:t>
             </w:r>
-            <w:proofErr w:type="spellStart"/>
+          </w:p>
+        </w:tc>
+      </w:tr>
+      <w:tr>
+        <w:trPr>
+          <w:trHeight w:val="491"/>
+        </w:trPr>
+        <w:tc>
+          <w:tcPr>
+            <w:tcW w:w="2889" w:type="dxa"/>
+          </w:tcPr>
+          <w:p>
+            <w:pPr>
+              <w:jc w:val="center"/>
+              <w:rPr>
+                <w:b/>
+                <w:bCs/>
+              </w:rPr>
+            </w:pPr>
             <w:r>
-              <w:t>ex</w:t>
+              <w:rPr>
+                <w:b/>
+                <w:bCs/>
+              </w:rPr>
+              <w:t>RN06</w:t>
             </w:r>
-            <w:proofErr w:type="spellEnd"/>
+          </w:p>
+        </w:tc>
+        <w:tc>
+          <w:tcPr>
+            <w:tcW w:w="2889" w:type="dxa"/>
+          </w:tcPr>
+          <w:p>
+            <w:pPr>
+              <w:jc w:val="center"/>
+              <w:rPr>
+                <w:b/>
+                <w:bCs/>
+              </w:rPr>
+            </w:pPr>
             <w:r>
-              <w:t>: \x00 a \x1F) devem ser removidos para evitar que o novo arquivo gerado seja rejeitado pelo motor do Microsoft Excel.</w:t>
+              <w:rPr>
+                <w:b/>
+                <w:bCs/>
+              </w:rPr>
+              <w:t>Tratamento de Duplicidade</w:t>
+            </w:r>
+          </w:p>
+        </w:tc>
+        <w:tc>
+          <w:tcPr>
+            <w:tcW w:w="2890" w:type="dxa"/>
+          </w:tcPr>
+          <w:p>
+            <w:pPr>
+              <w:rPr>
+                <w:b/>
+                <w:bCs/>
+              </w:rPr>
+            </w:pPr>
+            <w:r>
+              <w:rPr>
+                <w:b/>
+                <w:bCs/>
+              </w:rPr>
+              <w:t>O sistema deve identificar linhas idênticas usando criptografia (Hash MD5) por uma questão de performance. Ao detectar cópias, o sistema permite 3 abordagens: ask (bloqueia e pergunta ao usuário), remove (limpa as duplicatas) ou keep (ignora a checagem e mantém as cópias).</w:t>
             </w:r>
           </w:p>
         </w:tc>
       </w:tr>
     </w:tbl>
-    <w:p/>
+    <w:p>
+      <w:pPr>
+        <w:rPr>
+          <w:b/>
+          <w:bCs/>
+        </w:rPr>
+      </w:pPr>
+    </w:p>
+    <w:p>
+      <w:pPr>
+        <w:rPr>
+          <w:b/>
+          <w:bCs/>
+        </w:rPr>
+      </w:pPr>
+    </w:p>
+    <w:p>
+      <w:pPr>
+        <w:rPr>
+          <w:b/>
+          <w:bCs/>
+        </w:rPr>
+      </w:pPr>
+    </w:p>
+    <w:p>
+      <w:pPr>
+        <w:rPr>
+          <w:b/>
+          <w:bCs/>
+        </w:rPr>
+      </w:pPr>
+    </w:p>
+    <w:p>
+      <w:pPr>
+        <w:rPr>
+          <w:b/>
+          <w:bCs/>
+        </w:rPr>
+      </w:pPr>
+    </w:p>
+    <w:p>
+      <w:pPr>
+        <w:rPr>
+          <w:b/>
+          <w:bCs/>
+        </w:rPr>
+      </w:pPr>
+    </w:p>
+    <w:p>
+      <w:pPr>
+        <w:rPr>
+          <w:b/>
+          <w:bCs/>
+        </w:rPr>
+      </w:pPr>
+    </w:p>
+    <w:p>
+      <w:pPr>
+        <w:rPr>
+          <w:b/>
+          <w:bCs/>
+        </w:rPr>
+      </w:pPr>
+    </w:p>
+    <w:p>
+      <w:pPr>
+        <w:rPr>
+          <w:b/>
+          <w:bCs/>
+        </w:rPr>
+      </w:pPr>
+    </w:p>
+    <w:p>
+      <w:pPr>
+        <w:rPr>
+          <w:b/>
+          <w:bCs/>
+        </w:rPr>
+      </w:pPr>
+    </w:p>
+    <w:p>
+      <w:pPr>
+        <w:rPr>
+          <w:b/>
+          <w:bCs/>
+        </w:rPr>
+      </w:pPr>
+    </w:p>
+    <w:p>
+      <w:pPr>
+        <w:rPr>
+          <w:b/>
+          <w:bCs/>
+        </w:rPr>
+      </w:pPr>
+    </w:p>
     <w:p>
       <w:pPr>
         <w:rPr>
@@ -751,10 +769,16 @@
       </w:r>
     </w:p>
     <w:p>
-      <w:r>
-        <w:rPr>
-          <w:i/>
-          <w:iCs/>
+      <w:pPr>
+        <w:rPr>
+          <w:b/>
+          <w:bCs/>
+        </w:rPr>
+      </w:pPr>
+      <w:r>
+        <w:rPr>
+          <w:b/>
+          <w:bCs/>
         </w:rPr>
         <w:t>O que o sistema oferece ao usuário.</w:t>
       </w:r>
@@ -763,402 +787,479 @@
       <w:pPr>
         <w:numPr>
           <w:ilvl w:val="0"/>
-          <w:numId w:val="1"/>
+          <w:numId w:val="4"/>
         </w:numPr>
-      </w:pPr>
-      <w:r>
-        <w:rPr>
-          <w:b/>
-          <w:bCs/>
-        </w:rPr>
-        <w:t>RF01:</w:t>
-      </w:r>
-      <w:r>
-        <w:t xml:space="preserve"> Permitir o upload de arquivos via "Drag </w:t>
-      </w:r>
-      <w:proofErr w:type="spellStart"/>
-      <w:r>
-        <w:t>and</w:t>
-      </w:r>
-      <w:proofErr w:type="spellEnd"/>
-      <w:r>
-        <w:t xml:space="preserve"> Drop" ou seleção direta.</w:t>
+        <w:rPr>
+          <w:b/>
+          <w:bCs/>
+        </w:rPr>
+      </w:pPr>
+      <w:r>
+        <w:rPr>
+          <w:b/>
+          <w:bCs/>
+        </w:rPr>
+        <w:t>RF01: Permitir o upload de arquivos via "Drag and Drop" ou seleção direta.</w:t>
       </w:r>
     </w:p>
     <w:p>
       <w:pPr>
         <w:numPr>
           <w:ilvl w:val="0"/>
-          <w:numId w:val="1"/>
+          <w:numId w:val="4"/>
         </w:numPr>
-      </w:pPr>
-      <w:r>
-        <w:rPr>
-          <w:b/>
-          <w:bCs/>
-        </w:rPr>
-        <w:t>RF02:</w:t>
-      </w:r>
-      <w:r>
-        <w:t xml:space="preserve"> Validar a extensão do arquivo (apenas .</w:t>
-      </w:r>
-      <w:proofErr w:type="spellStart"/>
-      <w:r>
-        <w:t>xlsx</w:t>
-      </w:r>
-      <w:proofErr w:type="spellEnd"/>
-      <w:r>
-        <w:t>) e o tamanho antes do envio ao servidor.</w:t>
+        <w:rPr>
+          <w:b/>
+          <w:bCs/>
+        </w:rPr>
+      </w:pPr>
+      <w:r>
+        <w:rPr>
+          <w:b/>
+          <w:bCs/>
+        </w:rPr>
+        <w:t>RF02: Validar a extensão do arquivo (apenas arquivos modernos .xlsx) e o tamanho limite (25MB) antes do envio ao servidor.</w:t>
       </w:r>
     </w:p>
     <w:p>
       <w:pPr>
         <w:numPr>
           <w:ilvl w:val="0"/>
-          <w:numId w:val="1"/>
+          <w:numId w:val="4"/>
         </w:numPr>
-      </w:pPr>
-      <w:r>
-        <w:rPr>
-          <w:b/>
-          <w:bCs/>
-        </w:rPr>
-        <w:t>RF03:</w:t>
-      </w:r>
-      <w:r>
-        <w:t xml:space="preserve"> Exibir indicador visual de progresso (</w:t>
-      </w:r>
-      <w:proofErr w:type="spellStart"/>
-      <w:r>
-        <w:t>Loader</w:t>
-      </w:r>
-      <w:proofErr w:type="spellEnd"/>
-      <w:r>
-        <w:t>) durante o processamento.</w:t>
+        <w:rPr>
+          <w:b/>
+          <w:bCs/>
+        </w:rPr>
+      </w:pPr>
+      <w:r>
+        <w:rPr>
+          <w:b/>
+          <w:bCs/>
+        </w:rPr>
+        <w:t>RF03: Exibir indicador visual de progresso (Loader) durante o processamento.</w:t>
       </w:r>
     </w:p>
     <w:p>
       <w:pPr>
         <w:numPr>
           <w:ilvl w:val="0"/>
-          <w:numId w:val="1"/>
+          <w:numId w:val="4"/>
         </w:numPr>
-      </w:pPr>
-      <w:r>
-        <w:rPr>
-          <w:b/>
-          <w:bCs/>
-        </w:rPr>
-        <w:t>RF04:</w:t>
-      </w:r>
-      <w:r>
-        <w:t xml:space="preserve"> Realizar o download automático do arquivo processado sem intervenção manual após o término.</w:t>
+        <w:rPr>
+          <w:b/>
+          <w:bCs/>
+        </w:rPr>
+      </w:pPr>
+      <w:r>
+        <w:rPr>
+          <w:b/>
+          <w:bCs/>
+        </w:rPr>
+        <w:t>RF04: Realizar o download automático do arquivo processado sem intervenção manual após o término.</w:t>
       </w:r>
     </w:p>
     <w:p>
       <w:pPr>
         <w:numPr>
           <w:ilvl w:val="0"/>
-          <w:numId w:val="1"/>
+          <w:numId w:val="4"/>
         </w:numPr>
-      </w:pPr>
-      <w:r>
-        <w:rPr>
-          <w:b/>
-          <w:bCs/>
-        </w:rPr>
-        <w:t>RF05:</w:t>
-      </w:r>
-      <w:r>
-        <w:t xml:space="preserve"> Apresentar relatório final contendo: Total de abas processadas e total de linhas recuperadas.</w:t>
-      </w:r>
-    </w:p>
-    <w:p>
-      <w:pPr>
-        <w:rPr>
-          <w:b/>
-          <w:bCs/>
-        </w:rPr>
-      </w:pPr>
-      <w:r>
-        <w:rPr>
-          <w:b/>
-          <w:bCs/>
-        </w:rPr>
-        <w:t>3.2 Requisitos Não Funcionais (RNF)</w:t>
-      </w:r>
-    </w:p>
-    <w:p>
-      <w:r>
-        <w:rPr>
-          <w:i/>
-          <w:iCs/>
-        </w:rPr>
-        <w:t>Critérios de qualidade e técnicos.</w:t>
+        <w:rPr>
+          <w:b/>
+          <w:bCs/>
+        </w:rPr>
+      </w:pPr>
+      <w:r>
+        <w:rPr>
+          <w:b/>
+          <w:bCs/>
+        </w:rPr>
+        <w:t>RF05: Apresentar relatório final contendo: Total de abas processadas e total de linhas recuperadas (via headers X-Recovery-Sheets e X-Recovery-Rows).</w:t>
       </w:r>
     </w:p>
     <w:p>
       <w:pPr>
         <w:numPr>
           <w:ilvl w:val="0"/>
-          <w:numId w:val="2"/>
+          <w:numId w:val="4"/>
         </w:numPr>
-      </w:pPr>
-      <w:r>
-        <w:rPr>
-          <w:b/>
-          <w:bCs/>
-        </w:rPr>
-        <w:t>RNF01 (Performance):</w:t>
-      </w:r>
-      <w:r>
-        <w:t xml:space="preserve"> Uso de </w:t>
-      </w:r>
-      <w:proofErr w:type="spellStart"/>
-      <w:r>
-        <w:rPr>
-          <w:b/>
-          <w:bCs/>
-        </w:rPr>
-        <w:t>Streams</w:t>
-      </w:r>
-      <w:proofErr w:type="spellEnd"/>
-      <w:r>
-        <w:t xml:space="preserve"> para processamento (Node.js + </w:t>
-      </w:r>
-      <w:proofErr w:type="spellStart"/>
-      <w:r>
-        <w:t>ExcelJS</w:t>
-      </w:r>
-      <w:proofErr w:type="spellEnd"/>
-      <w:r>
-        <w:t xml:space="preserve">), garantindo que o consumo de memória RAM não exceda </w:t>
-      </w:r>
-      <w:r>
-        <w:rPr>
-          <w:b/>
-          <w:bCs/>
-        </w:rPr>
-        <w:t>512MB</w:t>
-      </w:r>
-      <w:r>
-        <w:t>.</w:t>
+        <w:rPr>
+          <w:b/>
+          <w:bCs/>
+        </w:rPr>
+      </w:pPr>
+      <w:r>
+        <w:rPr>
+          <w:b/>
+          <w:bCs/>
+        </w:rPr>
+        <w:t>RF06: Detectar informações duplicadas e fornecer ao usuário a opção interativa de prosseguir removendo ou mantendo as linhas idênticas.</w:t>
+      </w:r>
+    </w:p>
+    <w:p>
+      <w:pPr>
+        <w:rPr>
+          <w:b/>
+          <w:bCs/>
+        </w:rPr>
+      </w:pPr>
+      <w:r>
+        <w:rPr>
+          <w:b/>
+          <w:bCs/>
+        </w:rPr>
+        <w:t>3.2 Requisitos Não Funcionais (RNF)</w:t>
+      </w:r>
+    </w:p>
+    <w:p>
+      <w:pPr>
+        <w:rPr>
+          <w:b/>
+          <w:bCs/>
+        </w:rPr>
+      </w:pPr>
+      <w:r>
+        <w:rPr>
+          <w:b/>
+          <w:bCs/>
+        </w:rPr>
+        <w:t>Critérios de qualidade e técnicos.</w:t>
       </w:r>
     </w:p>
     <w:p>
       <w:pPr>
         <w:numPr>
           <w:ilvl w:val="0"/>
-          <w:numId w:val="2"/>
+          <w:numId w:val="5"/>
         </w:numPr>
-      </w:pPr>
-      <w:r>
-        <w:rPr>
-          <w:b/>
-          <w:bCs/>
-        </w:rPr>
-        <w:lastRenderedPageBreak/>
-        <w:t>RNF02 (Escalabilidade):</w:t>
-      </w:r>
-      <w:r>
-        <w:t xml:space="preserve"> Implementação de um "Garbage </w:t>
-      </w:r>
-      <w:proofErr w:type="spellStart"/>
-      <w:r>
-        <w:t>Collector</w:t>
-      </w:r>
-      <w:proofErr w:type="spellEnd"/>
-      <w:r>
-        <w:t>" manual (Lixeiro Automático) para evitar o preenchimento do disco rígido do servidor.</w:t>
+        <w:rPr>
+          <w:b/>
+          <w:bCs/>
+        </w:rPr>
+      </w:pPr>
+      <w:r>
+        <w:rPr>
+          <w:b/>
+          <w:bCs/>
+        </w:rPr>
+        <w:t>RNF01 (Performance): Uso de Streams para processamento (Node.js + ExcelJS), garantindo que o consumo de memória RAM seja mínimo, não carregando o arquivo inteiro de uma vez.</w:t>
       </w:r>
     </w:p>
     <w:p>
       <w:pPr>
         <w:numPr>
           <w:ilvl w:val="0"/>
-          <w:numId w:val="2"/>
+          <w:numId w:val="5"/>
         </w:numPr>
-      </w:pPr>
-      <w:r>
-        <w:rPr>
-          <w:b/>
-          <w:bCs/>
-        </w:rPr>
-        <w:t>RNF03 (Compatibilidade):</w:t>
-      </w:r>
-      <w:r>
-        <w:t xml:space="preserve"> O </w:t>
-      </w:r>
-      <w:proofErr w:type="spellStart"/>
-      <w:r>
-        <w:t>backend</w:t>
-      </w:r>
-      <w:proofErr w:type="spellEnd"/>
-      <w:r>
-        <w:t xml:space="preserve"> deve suportar a porta dinâmica atribuída pela hospedagem (</w:t>
-      </w:r>
-      <w:proofErr w:type="spellStart"/>
-      <w:r>
-        <w:t>ex</w:t>
-      </w:r>
-      <w:proofErr w:type="spellEnd"/>
-      <w:r>
-        <w:t>: Render/</w:t>
-      </w:r>
-      <w:proofErr w:type="spellStart"/>
-      <w:r>
-        <w:t>Heroku</w:t>
-      </w:r>
-      <w:proofErr w:type="spellEnd"/>
-      <w:r>
-        <w:t>).</w:t>
+        <w:rPr>
+          <w:b/>
+          <w:bCs/>
+        </w:rPr>
+      </w:pPr>
+      <w:r>
+        <w:rPr>
+          <w:b/>
+          <w:bCs/>
+        </w:rPr>
+        <w:t>RNF02 (Escalabilidade): Implementação de um "Garbage Collector" manual (FileManager.cleanOldFiles) sendo executado a cada 5 minutos para evitar o preenchimento do disco rígido do servidor.</w:t>
       </w:r>
     </w:p>
     <w:p>
       <w:pPr>
         <w:numPr>
           <w:ilvl w:val="0"/>
-          <w:numId w:val="2"/>
+          <w:numId w:val="5"/>
         </w:numPr>
-      </w:pPr>
-      <w:r>
-        <w:rPr>
-          <w:b/>
-          <w:bCs/>
-        </w:rPr>
-        <w:t>RNF04 (UX):</w:t>
-      </w:r>
-      <w:r>
-        <w:t xml:space="preserve"> Interface minimalista e responsiva para funcionamento em dispositivos móveis e desktop.</w:t>
-      </w:r>
-    </w:p>
-    <w:p/>
-    <w:p>
-      <w:pPr>
-        <w:rPr>
-          <w:b/>
-          <w:bCs/>
-        </w:rPr>
-      </w:pPr>
-      <w:r>
-        <w:rPr>
-          <w:b/>
-          <w:bCs/>
-        </w:rPr>
-        <w:t>4. CASOS DE TESTE (TEST CASES) - FOCO QA</w:t>
-      </w:r>
-    </w:p>
-    <w:p>
-      <w:r>
-        <w:rPr>
-          <w:i/>
-          <w:iCs/>
-        </w:rPr>
-        <w:t>Como garantimos que o sistema não falhe.</w:t>
+        <w:rPr>
+          <w:b/>
+          <w:bCs/>
+        </w:rPr>
+      </w:pPr>
+      <w:r>
+        <w:rPr>
+          <w:b/>
+          <w:bCs/>
+        </w:rPr>
+        <w:t>RNF03 (Compatibilidade): O backend deve suportar a porta dinâmica atribuída pela hospedagem (ex: Render/Heroku) e requisições CORS adequadas.</w:t>
       </w:r>
     </w:p>
     <w:p>
       <w:pPr>
         <w:numPr>
           <w:ilvl w:val="0"/>
-          <w:numId w:val="3"/>
+          <w:numId w:val="5"/>
         </w:numPr>
-      </w:pPr>
-      <w:r>
-        <w:rPr>
-          <w:b/>
-          <w:bCs/>
-        </w:rPr>
-        <w:t>CT01 (Caminho Feliz):</w:t>
-      </w:r>
-      <w:r>
-        <w:t xml:space="preserve"> Subir arquivo corrompido de 5MB -&gt; Resultado: Download automático de arquivo funcional.</w:t>
+        <w:rPr>
+          <w:b/>
+          <w:bCs/>
+        </w:rPr>
+      </w:pPr>
+      <w:r>
+        <w:rPr>
+          <w:b/>
+          <w:bCs/>
+        </w:rPr>
+        <w:t>RNF04 (UX): Interface minimalista e responsiva para funcionamento em dispositivos móveis e desktop.</w:t>
+      </w:r>
+    </w:p>
+    <w:p>
+      <w:pPr>
+        <w:rPr>
+          <w:b/>
+          <w:bCs/>
+        </w:rPr>
+      </w:pPr>
+    </w:p>
+    <w:p>
+      <w:pPr>
+        <w:rPr>
+          <w:b/>
+          <w:bCs/>
+        </w:rPr>
+      </w:pPr>
+      <w:r>
+        <w:rPr>
+          <w:b/>
+          <w:bCs/>
+        </w:rPr>
+        <w:t>4. CASOS DE TESTE (TEST CASES) - FOCO QA</w:t>
+      </w:r>
+    </w:p>
+    <w:p>
+      <w:pPr>
+        <w:rPr>
+          <w:b/>
+          <w:bCs/>
+        </w:rPr>
+      </w:pPr>
+      <w:r>
+        <w:rPr>
+          <w:b/>
+          <w:bCs/>
+        </w:rPr>
+        <w:t>Como garantimos que o sistema não falhe.</w:t>
       </w:r>
     </w:p>
     <w:p>
       <w:pPr>
         <w:numPr>
           <w:ilvl w:val="0"/>
-          <w:numId w:val="3"/>
+          <w:numId w:val="6"/>
         </w:numPr>
-      </w:pPr>
-      <w:r>
-        <w:rPr>
-          <w:b/>
-          <w:bCs/>
-        </w:rPr>
-        <w:t>CT02 (Limite de Borda):</w:t>
-      </w:r>
-      <w:r>
-        <w:t xml:space="preserve"> Subir arquivo de 26MB -&gt; Resultado: Bloqueio imediato no </w:t>
-      </w:r>
-      <w:proofErr w:type="spellStart"/>
-      <w:r>
-        <w:t>frontend</w:t>
-      </w:r>
-      <w:proofErr w:type="spellEnd"/>
-      <w:r>
-        <w:t xml:space="preserve"> com mensagem de erro amigável.</w:t>
+        <w:rPr>
+          <w:b/>
+          <w:bCs/>
+        </w:rPr>
+      </w:pPr>
+      <w:r>
+        <w:rPr>
+          <w:b/>
+          <w:bCs/>
+        </w:rPr>
+        <w:t>CT01 (Caminho Feliz): Subir arquivo corrompido de 5MB</w:t>
+      </w:r>
+    </w:p>
+    <w:p>
+      <w:pPr>
+        <w:ind w:left="720"/>
+        <w:rPr>
+          <w:b/>
+          <w:bCs/>
+        </w:rPr>
+      </w:pPr>
+      <w:r>
+        <w:rPr>
+          <w:b/>
+          <w:bCs/>
+        </w:rPr>
+        <w:lastRenderedPageBreak/>
+        <w:t> Resultado: Download automático de arquivo funcional e cabeçalhos HTTP de contagem de linhas validados.</w:t>
       </w:r>
     </w:p>
     <w:p>
       <w:pPr>
         <w:numPr>
           <w:ilvl w:val="0"/>
-          <w:numId w:val="3"/>
+          <w:numId w:val="6"/>
         </w:numPr>
-      </w:pPr>
-      <w:r>
-        <w:rPr>
-          <w:b/>
-          <w:bCs/>
-        </w:rPr>
-        <w:t>CT03 (Segurança):</w:t>
-      </w:r>
-      <w:r>
-        <w:t xml:space="preserve"> Tentar acessar a URL direta do arquivo recuperado após o download -&gt; Resultado: Erro 404 (Arquivo deletado).</w:t>
+        <w:rPr>
+          <w:b/>
+          <w:bCs/>
+        </w:rPr>
+      </w:pPr>
+      <w:r>
+        <w:rPr>
+          <w:b/>
+          <w:bCs/>
+        </w:rPr>
+        <w:t xml:space="preserve">CT02 (Limite de Borda): Subir arquivo de 26MB </w:t>
+      </w:r>
+    </w:p>
+    <w:p>
+      <w:pPr>
+        <w:ind w:left="720"/>
+        <w:rPr>
+          <w:b/>
+          <w:bCs/>
+        </w:rPr>
+      </w:pPr>
+      <w:r>
+        <w:rPr>
+          <w:b/>
+          <w:bCs/>
+        </w:rPr>
+        <w:t> Resultado: Bloqueio imediato no frontend/backend (Multer Error) com mensagem de erro amigável.</w:t>
       </w:r>
     </w:p>
     <w:p>
       <w:pPr>
         <w:numPr>
           <w:ilvl w:val="0"/>
-          <w:numId w:val="3"/>
+          <w:numId w:val="6"/>
         </w:numPr>
-      </w:pPr>
-      <w:r>
-        <w:rPr>
-          <w:b/>
-          <w:bCs/>
-        </w:rPr>
-        <w:t>CT04 (Resiliência):</w:t>
-      </w:r>
-      <w:r>
-        <w:t xml:space="preserve"> Subir planilha com 100 mil linhas -&gt; Resultado: Processamento concluído via </w:t>
-      </w:r>
-      <w:proofErr w:type="spellStart"/>
-      <w:r>
-        <w:t>Stream</w:t>
-      </w:r>
-      <w:proofErr w:type="spellEnd"/>
-      <w:r>
-        <w:t xml:space="preserve"> sem queda por "Out </w:t>
-      </w:r>
-      <w:proofErr w:type="spellStart"/>
-      <w:r>
-        <w:t>of</w:t>
-      </w:r>
-      <w:proofErr w:type="spellEnd"/>
-      <w:r>
-        <w:t xml:space="preserve"> </w:t>
-      </w:r>
-      <w:proofErr w:type="spellStart"/>
-      <w:r>
-        <w:t>Memory</w:t>
-      </w:r>
-      <w:proofErr w:type="spellEnd"/>
-      <w:r>
-        <w:t>".</w:t>
+        <w:rPr>
+          <w:b/>
+          <w:bCs/>
+        </w:rPr>
+      </w:pPr>
+      <w:r>
+        <w:rPr>
+          <w:b/>
+          <w:bCs/>
+        </w:rPr>
+        <w:t>CT03 (Segurança): Tentar acessar a URL direta do arquivo recuperado após o downloa</w:t>
+      </w:r>
+      <w:r>
+        <w:rPr>
+          <w:b/>
+          <w:bCs/>
+        </w:rPr>
+        <w:t>d</w:t>
+      </w:r>
+    </w:p>
+    <w:p>
+      <w:pPr>
+        <w:ind w:left="720"/>
+        <w:rPr>
+          <w:b/>
+          <w:bCs/>
+        </w:rPr>
+      </w:pPr>
+      <w:r>
+        <w:rPr>
+          <w:b/>
+          <w:bCs/>
+        </w:rPr>
+        <w:t> Resultado: Erro 404 (Arquivo já foi deletado via fs.unlink).</w:t>
+      </w:r>
+    </w:p>
+    <w:p>
+      <w:pPr>
+        <w:numPr>
+          <w:ilvl w:val="0"/>
+          <w:numId w:val="6"/>
+        </w:numPr>
+        <w:rPr>
+          <w:b/>
+          <w:bCs/>
+        </w:rPr>
+      </w:pPr>
+      <w:r>
+        <w:rPr>
+          <w:b/>
+          <w:bCs/>
+        </w:rPr>
+        <w:t>CT04 (Resiliência): Subir planilha com 100 mil linhas Resultado: Processamento concluído via Stream sem queda por "Out of Memory".</w:t>
+      </w:r>
+    </w:p>
+    <w:p>
+      <w:pPr>
+        <w:numPr>
+          <w:ilvl w:val="0"/>
+          <w:numId w:val="6"/>
+        </w:numPr>
+        <w:rPr>
+          <w:b/>
+          <w:bCs/>
+        </w:rPr>
+      </w:pPr>
+      <w:r>
+        <w:rPr>
+          <w:b/>
+          <w:bCs/>
+        </w:rPr>
+        <w:t>CT05 (Detecção de Duplicidade - Interrupção): Subir planilha com linhas idênticas sem especificar ação prévia (duplicateAction='ask') -&gt; Resultado: A API barra o processo e retorna Erro HTTP 409 (Conflict) informando sobre a duplicidade.</w:t>
+      </w:r>
+    </w:p>
+    <w:p>
+      <w:pPr>
+        <w:numPr>
+          <w:ilvl w:val="0"/>
+          <w:numId w:val="6"/>
+        </w:numPr>
+        <w:rPr>
+          <w:b/>
+          <w:bCs/>
+        </w:rPr>
+      </w:pPr>
+      <w:r>
+        <w:rPr>
+          <w:b/>
+          <w:bCs/>
+        </w:rPr>
+        <w:t>CT06 (Remoção de Duplicidade): Subir planilha com duplicatas enviando a instrução duplicateAction='remove' </w:t>
+      </w:r>
+    </w:p>
+    <w:p>
+      <w:pPr>
+        <w:ind w:left="720"/>
+        <w:rPr>
+          <w:b/>
+          <w:bCs/>
+        </w:rPr>
+      </w:pPr>
+      <w:r>
+        <w:rPr>
+          <w:b/>
+          <w:bCs/>
+        </w:rPr>
+        <w:t> Resultado: Arquivo gerado com sucesso contendo as linhas filtradas (sem cópias).</w:t>
+      </w:r>
+    </w:p>
+    <w:p>
+      <w:pPr>
+        <w:numPr>
+          <w:ilvl w:val="0"/>
+          <w:numId w:val="6"/>
+        </w:numPr>
+        <w:rPr>
+          <w:b/>
+          <w:bCs/>
+        </w:rPr>
+      </w:pPr>
+      <w:r>
+        <w:rPr>
+          <w:b/>
+          <w:bCs/>
+        </w:rPr>
+        <w:t>CT07 (Manutenção de Duplicidade): Subir planilha com duplicatas enviando a instrução duplicateAction='keep' </w:t>
+      </w:r>
+    </w:p>
+    <w:p>
+      <w:pPr>
+        <w:ind w:left="720"/>
+        <w:rPr>
+          <w:b/>
+          <w:bCs/>
+        </w:rPr>
+      </w:pPr>
+      <w:r>
+        <w:rPr>
+          <w:b/>
+          <w:bCs/>
+        </w:rPr>
+        <w:t> Resultado: Arquivo gerado com sucesso, ignorando a trava e mantendo as informações copiadas intocadas.</w:t>
       </w:r>
     </w:p>
     <w:p/>
@@ -1585,6 +1686,417 @@
       </w:pPr>
     </w:lvl>
   </w:abstractNum>
+  <w:abstractNum w:abstractNumId="3" w15:restartNumberingAfterBreak="0">
+    <w:nsid w:val="353C0E7C"/>
+    <w:multiLevelType w:val="multilevel"/>
+    <w:tmpl w:val="B24C8E08"/>
+    <w:lvl w:ilvl="0">
+      <w:start w:val="1"/>
+      <w:numFmt w:val="bullet"/>
+      <w:lvlText w:val=""/>
+      <w:lvlJc w:val="left"/>
+      <w:pPr>
+        <w:tabs>
+          <w:tab w:val="num" w:pos="720"/>
+        </w:tabs>
+        <w:ind w:left="720" w:hanging="360"/>
+      </w:pPr>
+      <w:rPr>
+        <w:rFonts w:ascii="Symbol" w:hAnsi="Symbol" w:hint="default"/>
+        <w:sz w:val="20"/>
+      </w:rPr>
+    </w:lvl>
+    <w:lvl w:ilvl="1" w:tentative="1">
+      <w:start w:val="1"/>
+      <w:numFmt w:val="bullet"/>
+      <w:lvlText w:val="o"/>
+      <w:lvlJc w:val="left"/>
+      <w:pPr>
+        <w:tabs>
+          <w:tab w:val="num" w:pos="1440"/>
+        </w:tabs>
+        <w:ind w:left="1440" w:hanging="360"/>
+      </w:pPr>
+      <w:rPr>
+        <w:rFonts w:ascii="Courier New" w:hAnsi="Courier New" w:hint="default"/>
+        <w:sz w:val="20"/>
+      </w:rPr>
+    </w:lvl>
+    <w:lvl w:ilvl="2" w:tentative="1">
+      <w:start w:val="1"/>
+      <w:numFmt w:val="bullet"/>
+      <w:lvlText w:val=""/>
+      <w:lvlJc w:val="left"/>
+      <w:pPr>
+        <w:tabs>
+          <w:tab w:val="num" w:pos="2160"/>
+        </w:tabs>
+        <w:ind w:left="2160" w:hanging="360"/>
+      </w:pPr>
+      <w:rPr>
+        <w:rFonts w:ascii="Wingdings" w:hAnsi="Wingdings" w:hint="default"/>
+        <w:sz w:val="20"/>
+      </w:rPr>
+    </w:lvl>
+    <w:lvl w:ilvl="3" w:tentative="1">
+      <w:start w:val="1"/>
+      <w:numFmt w:val="bullet"/>
+      <w:lvlText w:val=""/>
+      <w:lvlJc w:val="left"/>
+      <w:pPr>
+        <w:tabs>
+          <w:tab w:val="num" w:pos="2880"/>
+        </w:tabs>
+        <w:ind w:left="2880" w:hanging="360"/>
+      </w:pPr>
+      <w:rPr>
+        <w:rFonts w:ascii="Wingdings" w:hAnsi="Wingdings" w:hint="default"/>
+        <w:sz w:val="20"/>
+      </w:rPr>
+    </w:lvl>
+    <w:lvl w:ilvl="4" w:tentative="1">
+      <w:start w:val="1"/>
+      <w:numFmt w:val="bullet"/>
+      <w:lvlText w:val=""/>
+      <w:lvlJc w:val="left"/>
+      <w:pPr>
+        <w:tabs>
+          <w:tab w:val="num" w:pos="3600"/>
+        </w:tabs>
+        <w:ind w:left="3600" w:hanging="360"/>
+      </w:pPr>
+      <w:rPr>
+        <w:rFonts w:ascii="Wingdings" w:hAnsi="Wingdings" w:hint="default"/>
+        <w:sz w:val="20"/>
+      </w:rPr>
+    </w:lvl>
+    <w:lvl w:ilvl="5" w:tentative="1">
+      <w:start w:val="1"/>
+      <w:numFmt w:val="bullet"/>
+      <w:lvlText w:val=""/>
+      <w:lvlJc w:val="left"/>
+      <w:pPr>
+        <w:tabs>
+          <w:tab w:val="num" w:pos="4320"/>
+        </w:tabs>
+        <w:ind w:left="4320" w:hanging="360"/>
+      </w:pPr>
+      <w:rPr>
+        <w:rFonts w:ascii="Wingdings" w:hAnsi="Wingdings" w:hint="default"/>
+        <w:sz w:val="20"/>
+      </w:rPr>
+    </w:lvl>
+    <w:lvl w:ilvl="6" w:tentative="1">
+      <w:start w:val="1"/>
+      <w:numFmt w:val="bullet"/>
+      <w:lvlText w:val=""/>
+      <w:lvlJc w:val="left"/>
+      <w:pPr>
+        <w:tabs>
+          <w:tab w:val="num" w:pos="5040"/>
+        </w:tabs>
+        <w:ind w:left="5040" w:hanging="360"/>
+      </w:pPr>
+      <w:rPr>
+        <w:rFonts w:ascii="Wingdings" w:hAnsi="Wingdings" w:hint="default"/>
+        <w:sz w:val="20"/>
+      </w:rPr>
+    </w:lvl>
+    <w:lvl w:ilvl="7" w:tentative="1">
+      <w:start w:val="1"/>
+      <w:numFmt w:val="bullet"/>
+      <w:lvlText w:val=""/>
+      <w:lvlJc w:val="left"/>
+      <w:pPr>
+        <w:tabs>
+          <w:tab w:val="num" w:pos="5760"/>
+        </w:tabs>
+        <w:ind w:left="5760" w:hanging="360"/>
+      </w:pPr>
+      <w:rPr>
+        <w:rFonts w:ascii="Wingdings" w:hAnsi="Wingdings" w:hint="default"/>
+        <w:sz w:val="20"/>
+      </w:rPr>
+    </w:lvl>
+    <w:lvl w:ilvl="8" w:tentative="1">
+      <w:start w:val="1"/>
+      <w:numFmt w:val="bullet"/>
+      <w:lvlText w:val=""/>
+      <w:lvlJc w:val="left"/>
+      <w:pPr>
+        <w:tabs>
+          <w:tab w:val="num" w:pos="6480"/>
+        </w:tabs>
+        <w:ind w:left="6480" w:hanging="360"/>
+      </w:pPr>
+      <w:rPr>
+        <w:rFonts w:ascii="Wingdings" w:hAnsi="Wingdings" w:hint="default"/>
+        <w:sz w:val="20"/>
+      </w:rPr>
+    </w:lvl>
+  </w:abstractNum>
+  <w:abstractNum w:abstractNumId="4" w15:restartNumberingAfterBreak="0">
+    <w:nsid w:val="3A3D6E95"/>
+    <w:multiLevelType w:val="multilevel"/>
+    <w:tmpl w:val="4F90A26E"/>
+    <w:lvl w:ilvl="0">
+      <w:start w:val="1"/>
+      <w:numFmt w:val="decimal"/>
+      <w:lvlText w:val="%1."/>
+      <w:lvlJc w:val="left"/>
+      <w:pPr>
+        <w:tabs>
+          <w:tab w:val="num" w:pos="720"/>
+        </w:tabs>
+        <w:ind w:left="720" w:hanging="360"/>
+      </w:pPr>
+    </w:lvl>
+    <w:lvl w:ilvl="1" w:tentative="1">
+      <w:start w:val="1"/>
+      <w:numFmt w:val="decimal"/>
+      <w:lvlText w:val="%2."/>
+      <w:lvlJc w:val="left"/>
+      <w:pPr>
+        <w:tabs>
+          <w:tab w:val="num" w:pos="1440"/>
+        </w:tabs>
+        <w:ind w:left="1440" w:hanging="360"/>
+      </w:pPr>
+    </w:lvl>
+    <w:lvl w:ilvl="2" w:tentative="1">
+      <w:start w:val="1"/>
+      <w:numFmt w:val="decimal"/>
+      <w:lvlText w:val="%3."/>
+      <w:lvlJc w:val="left"/>
+      <w:pPr>
+        <w:tabs>
+          <w:tab w:val="num" w:pos="2160"/>
+        </w:tabs>
+        <w:ind w:left="2160" w:hanging="360"/>
+      </w:pPr>
+    </w:lvl>
+    <w:lvl w:ilvl="3" w:tentative="1">
+      <w:start w:val="1"/>
+      <w:numFmt w:val="decimal"/>
+      <w:lvlText w:val="%4."/>
+      <w:lvlJc w:val="left"/>
+      <w:pPr>
+        <w:tabs>
+          <w:tab w:val="num" w:pos="2880"/>
+        </w:tabs>
+        <w:ind w:left="2880" w:hanging="360"/>
+      </w:pPr>
+    </w:lvl>
+    <w:lvl w:ilvl="4" w:tentative="1">
+      <w:start w:val="1"/>
+      <w:numFmt w:val="decimal"/>
+      <w:lvlText w:val="%5."/>
+      <w:lvlJc w:val="left"/>
+      <w:pPr>
+        <w:tabs>
+          <w:tab w:val="num" w:pos="3600"/>
+        </w:tabs>
+        <w:ind w:left="3600" w:hanging="360"/>
+      </w:pPr>
+    </w:lvl>
+    <w:lvl w:ilvl="5" w:tentative="1">
+      <w:start w:val="1"/>
+      <w:numFmt w:val="decimal"/>
+      <w:lvlText w:val="%6."/>
+      <w:lvlJc w:val="left"/>
+      <w:pPr>
+        <w:tabs>
+          <w:tab w:val="num" w:pos="4320"/>
+        </w:tabs>
+        <w:ind w:left="4320" w:hanging="360"/>
+      </w:pPr>
+    </w:lvl>
+    <w:lvl w:ilvl="6" w:tentative="1">
+      <w:start w:val="1"/>
+      <w:numFmt w:val="decimal"/>
+      <w:lvlText w:val="%7."/>
+      <w:lvlJc w:val="left"/>
+      <w:pPr>
+        <w:tabs>
+          <w:tab w:val="num" w:pos="5040"/>
+        </w:tabs>
+        <w:ind w:left="5040" w:hanging="360"/>
+      </w:pPr>
+    </w:lvl>
+    <w:lvl w:ilvl="7" w:tentative="1">
+      <w:start w:val="1"/>
+      <w:numFmt w:val="decimal"/>
+      <w:lvlText w:val="%8."/>
+      <w:lvlJc w:val="left"/>
+      <w:pPr>
+        <w:tabs>
+          <w:tab w:val="num" w:pos="5760"/>
+        </w:tabs>
+        <w:ind w:left="5760" w:hanging="360"/>
+      </w:pPr>
+    </w:lvl>
+    <w:lvl w:ilvl="8" w:tentative="1">
+      <w:start w:val="1"/>
+      <w:numFmt w:val="decimal"/>
+      <w:lvlText w:val="%9."/>
+      <w:lvlJc w:val="left"/>
+      <w:pPr>
+        <w:tabs>
+          <w:tab w:val="num" w:pos="6480"/>
+        </w:tabs>
+        <w:ind w:left="6480" w:hanging="360"/>
+      </w:pPr>
+    </w:lvl>
+  </w:abstractNum>
+  <w:abstractNum w:abstractNumId="5" w15:restartNumberingAfterBreak="0">
+    <w:nsid w:val="716446A4"/>
+    <w:multiLevelType w:val="multilevel"/>
+    <w:tmpl w:val="6D26CCEA"/>
+    <w:lvl w:ilvl="0">
+      <w:start w:val="1"/>
+      <w:numFmt w:val="bullet"/>
+      <w:lvlText w:val=""/>
+      <w:lvlJc w:val="left"/>
+      <w:pPr>
+        <w:tabs>
+          <w:tab w:val="num" w:pos="720"/>
+        </w:tabs>
+        <w:ind w:left="720" w:hanging="360"/>
+      </w:pPr>
+      <w:rPr>
+        <w:rFonts w:ascii="Symbol" w:hAnsi="Symbol" w:hint="default"/>
+        <w:sz w:val="20"/>
+      </w:rPr>
+    </w:lvl>
+    <w:lvl w:ilvl="1" w:tentative="1">
+      <w:start w:val="1"/>
+      <w:numFmt w:val="bullet"/>
+      <w:lvlText w:val="o"/>
+      <w:lvlJc w:val="left"/>
+      <w:pPr>
+        <w:tabs>
+          <w:tab w:val="num" w:pos="1440"/>
+        </w:tabs>
+        <w:ind w:left="1440" w:hanging="360"/>
+      </w:pPr>
+      <w:rPr>
+        <w:rFonts w:ascii="Courier New" w:hAnsi="Courier New" w:hint="default"/>
+        <w:sz w:val="20"/>
+      </w:rPr>
+    </w:lvl>
+    <w:lvl w:ilvl="2" w:tentative="1">
+      <w:start w:val="1"/>
+      <w:numFmt w:val="bullet"/>
+      <w:lvlText w:val=""/>
+      <w:lvlJc w:val="left"/>
+      <w:pPr>
+        <w:tabs>
+          <w:tab w:val="num" w:pos="2160"/>
+        </w:tabs>
+        <w:ind w:left="2160" w:hanging="360"/>
+      </w:pPr>
+      <w:rPr>
+        <w:rFonts w:ascii="Wingdings" w:hAnsi="Wingdings" w:hint="default"/>
+        <w:sz w:val="20"/>
+      </w:rPr>
+    </w:lvl>
+    <w:lvl w:ilvl="3" w:tentative="1">
+      <w:start w:val="1"/>
+      <w:numFmt w:val="bullet"/>
+      <w:lvlText w:val=""/>
+      <w:lvlJc w:val="left"/>
+      <w:pPr>
+        <w:tabs>
+          <w:tab w:val="num" w:pos="2880"/>
+        </w:tabs>
+        <w:ind w:left="2880" w:hanging="360"/>
+      </w:pPr>
+      <w:rPr>
+        <w:rFonts w:ascii="Wingdings" w:hAnsi="Wingdings" w:hint="default"/>
+        <w:sz w:val="20"/>
+      </w:rPr>
+    </w:lvl>
+    <w:lvl w:ilvl="4" w:tentative="1">
+      <w:start w:val="1"/>
+      <w:numFmt w:val="bullet"/>
+      <w:lvlText w:val=""/>
+      <w:lvlJc w:val="left"/>
+      <w:pPr>
+        <w:tabs>
+          <w:tab w:val="num" w:pos="3600"/>
+        </w:tabs>
+        <w:ind w:left="3600" w:hanging="360"/>
+      </w:pPr>
+      <w:rPr>
+        <w:rFonts w:ascii="Wingdings" w:hAnsi="Wingdings" w:hint="default"/>
+        <w:sz w:val="20"/>
+      </w:rPr>
+    </w:lvl>
+    <w:lvl w:ilvl="5" w:tentative="1">
+      <w:start w:val="1"/>
+      <w:numFmt w:val="bullet"/>
+      <w:lvlText w:val=""/>
+      <w:lvlJc w:val="left"/>
+      <w:pPr>
+        <w:tabs>
+          <w:tab w:val="num" w:pos="4320"/>
+        </w:tabs>
+        <w:ind w:left="4320" w:hanging="360"/>
+      </w:pPr>
+      <w:rPr>
+        <w:rFonts w:ascii="Wingdings" w:hAnsi="Wingdings" w:hint="default"/>
+        <w:sz w:val="20"/>
+      </w:rPr>
+    </w:lvl>
+    <w:lvl w:ilvl="6" w:tentative="1">
+      <w:start w:val="1"/>
+      <w:numFmt w:val="bullet"/>
+      <w:lvlText w:val=""/>
+      <w:lvlJc w:val="left"/>
+      <w:pPr>
+        <w:tabs>
+          <w:tab w:val="num" w:pos="5040"/>
+        </w:tabs>
+        <w:ind w:left="5040" w:hanging="360"/>
+      </w:pPr>
+      <w:rPr>
+        <w:rFonts w:ascii="Wingdings" w:hAnsi="Wingdings" w:hint="default"/>
+        <w:sz w:val="20"/>
+      </w:rPr>
+    </w:lvl>
+    <w:lvl w:ilvl="7" w:tentative="1">
+      <w:start w:val="1"/>
+      <w:numFmt w:val="bullet"/>
+      <w:lvlText w:val=""/>
+      <w:lvlJc w:val="left"/>
+      <w:pPr>
+        <w:tabs>
+          <w:tab w:val="num" w:pos="5760"/>
+        </w:tabs>
+        <w:ind w:left="5760" w:hanging="360"/>
+      </w:pPr>
+      <w:rPr>
+        <w:rFonts w:ascii="Wingdings" w:hAnsi="Wingdings" w:hint="default"/>
+        <w:sz w:val="20"/>
+      </w:rPr>
+    </w:lvl>
+    <w:lvl w:ilvl="8" w:tentative="1">
+      <w:start w:val="1"/>
+      <w:numFmt w:val="bullet"/>
+      <w:lvlText w:val=""/>
+      <w:lvlJc w:val="left"/>
+      <w:pPr>
+        <w:tabs>
+          <w:tab w:val="num" w:pos="6480"/>
+        </w:tabs>
+        <w:ind w:left="6480" w:hanging="360"/>
+      </w:pPr>
+      <w:rPr>
+        <w:rFonts w:ascii="Wingdings" w:hAnsi="Wingdings" w:hint="default"/>
+        <w:sz w:val="20"/>
+      </w:rPr>
+    </w:lvl>
+  </w:abstractNum>
   <w:num w:numId="1" w16cid:durableId="1049568932">
     <w:abstractNumId w:val="0"/>
   </w:num>
@@ -1593,6 +2105,15 @@
   </w:num>
   <w:num w:numId="3" w16cid:durableId="488636971">
     <w:abstractNumId w:val="2"/>
+  </w:num>
+  <w:num w:numId="4" w16cid:durableId="562370357">
+    <w:abstractNumId w:val="3"/>
+  </w:num>
+  <w:num w:numId="5" w16cid:durableId="1855917157">
+    <w:abstractNumId w:val="5"/>
+  </w:num>
+  <w:num w:numId="6" w16cid:durableId="2018077182">
+    <w:abstractNumId w:val="4"/>
   </w:num>
 </w:numbering>
 </file>
@@ -2513,6 +3034,25 @@
       <w:spacing w:val="5"/>
     </w:rPr>
   </w:style>
+  <w:style w:type="table" w:styleId="Tabelacomgrade">
+    <w:name w:val="Table Grid"/>
+    <w:basedOn w:val="Tabelanormal"/>
+    <w:uiPriority w:val="39"/>
+    <w:rsid w:val="007C1E45"/>
+    <w:pPr>
+      <w:spacing w:after="0" w:line="240" w:lineRule="auto"/>
+    </w:pPr>
+    <w:tblPr>
+      <w:tblBorders>
+        <w:top w:val="single" w:sz="4" w:space="0" w:color="auto"/>
+        <w:left w:val="single" w:sz="4" w:space="0" w:color="auto"/>
+        <w:bottom w:val="single" w:sz="4" w:space="0" w:color="auto"/>
+        <w:right w:val="single" w:sz="4" w:space="0" w:color="auto"/>
+        <w:insideH w:val="single" w:sz="4" w:space="0" w:color="auto"/>
+        <w:insideV w:val="single" w:sz="4" w:space="0" w:color="auto"/>
+      </w:tblBorders>
+    </w:tblPr>
+  </w:style>
 </w:styles>
 </file>
 

</xml_diff>